<commit_message>
Narrow Kaushik integration questions
</commit_message>
<xml_diff>
--- a/Person - 1 - Kaushik/docs/Questions_For_Team_Integration.docx
+++ b/Person - 1 - Kaushik/docs/Questions_For_Team_Integration.docx
@@ -136,78 +136,6 @@
         <w:pStyle w:val="Heading1"/>
       </w:pPr>
       <w:r>
-        <w:t>Questions For Person 3 - picoBlaze / PuTTY UI</w:t>
-      </w:r>
-    </w:p>
-    <w:p>
-      <w:pPr>
-        <w:pStyle w:val="ListNumber"/>
-      </w:pPr>
-      <w:r>
-        <w:t>What final command code will picoBlaze send for record?</w:t>
-      </w:r>
-    </w:p>
-    <w:p>
-      <w:pPr>
-        <w:pStyle w:val="ListNumber"/>
-      </w:pPr>
-      <w:r>
-        <w:t>What final command code will picoBlaze send for play?</w:t>
-      </w:r>
-    </w:p>
-    <w:p>
-      <w:pPr>
-        <w:pStyle w:val="ListNumber"/>
-      </w:pPr>
-      <w:r>
-        <w:t>What final command code will picoBlaze send for pause/resume?</w:t>
-      </w:r>
-    </w:p>
-    <w:p>
-      <w:pPr>
-        <w:pStyle w:val="ListNumber"/>
-      </w:pPr>
-      <w:r>
-        <w:t>What final command code will picoBlaze send for delete one message?</w:t>
-      </w:r>
-    </w:p>
-    <w:p>
-      <w:pPr>
-        <w:pStyle w:val="ListNumber"/>
-      </w:pPr>
-      <w:r>
-        <w:t>What final command code will picoBlaze send for delete all messages?</w:t>
-      </w:r>
-    </w:p>
-    <w:p>
-      <w:pPr>
-        <w:pStyle w:val="ListNumber"/>
-      </w:pPr>
-      <w:r>
-        <w:t>What final signal or command format will be used for volume control?</w:t>
-      </w:r>
-    </w:p>
-    <w:p>
-      <w:pPr>
-        <w:pStyle w:val="ListNumber"/>
-      </w:pPr>
-      <w:r>
-        <w:t>Should audio mute/passthrough be exposed as user commands, switches, or only debug controls?</w:t>
-      </w:r>
-    </w:p>
-    <w:p>
-      <w:pPr>
-        <w:pStyle w:val="ListNumber"/>
-      </w:pPr>
-      <w:r>
-        <w:t>Do you need audio status signals like codec_ready, sample_end, or sample_req reported back to the UI?</w:t>
-      </w:r>
-    </w:p>
-    <w:p>
-      <w:pPr>
-        <w:pStyle w:val="Heading1"/>
-      </w:pPr>
-      <w:r>
         <w:t>Questions For Person 4 - Top Module / Integration Lead</w:t>
       </w:r>
     </w:p>
@@ -240,7 +168,7 @@
         <w:pStyle w:val="ListNumber"/>
       </w:pPr>
       <w:r>
-        <w:t>Are you generating the required 100 MHz audio/picoBlaze clocks from RAM clkout as described in the project instructions?</w:t>
+        <w:t>Are you generating the required 100 MHz audio/system clocks from RAM clkout as described in the project instructions?</w:t>
       </w:r>
     </w:p>
     <w:p>
@@ -328,7 +256,7 @@
         <w:pStyle w:val="ListBullet"/>
       </w:pPr>
       <w:r>
-        <w:t>Tie mute_output = 1'b0 unless UI/top module controls mute.</w:t>
+        <w:t>Tie mute_output = 1'b0 unless the top module controls mute.</w:t>
       </w:r>
     </w:p>
     <w:p>
@@ -360,7 +288,7 @@
         <w:pStyle w:val="ListNumber"/>
       </w:pPr>
       <w:r>
-        <w:t>Update the wrapper if the team chooses 16-bit storage or defines a volume-control signal.</w:t>
+        <w:t>Update the wrapper if the team chooses 16-bit storage.</w:t>
       </w:r>
     </w:p>
     <w:sectPr>

</xml_diff>